<commit_message>
updated BC doctype to delete groupe
</commit_message>
<xml_diff>
--- a/flower_backend/doctypes/BC.docx
+++ b/flower_backend/doctypes/BC.docx
@@ -460,7 +460,31 @@
         <w:rPr>
           <w:rtl w:val="0"/>
         </w:rPr>
-        <w:t xml:space="preserve">représentée par {% if etude.docEtude.signer2.gender%}sa{%else%}son{%endif%} {{ etude.docEtude.signer2.position }} {% if etude.docEtude.signer2.gender%}Mme{%else%}M. {%endif%} {{ etude.docEtude.signer2.firstname }} {{ etude.docEtude.signer2.lastname }}</w:t>
+        <w:t xml:space="preserve">repr</w:t>
+      </w:r>
+      <w:sdt>
+        <w:sdtPr>
+          <w:tag w:val="goog_rdk_0"/>
+        </w:sdtPr>
+        <w:sdtContent>
+          <w:commentRangeStart w:id="0"/>
+        </w:sdtContent>
+      </w:sdt>
+      <w:r>
+        <w:rPr>
+          <w:rtl w:val="0"/>
+        </w:rPr>
+        <w:t xml:space="preserve">ésenté</w:t>
+      </w:r>
+      <w:commentRangeEnd w:id="0"/>
+      <w:r>
+        <w:commentReference w:id="0"/>
+      </w:r>
+      <w:r>
+        <w:rPr>
+          <w:rtl w:val="0"/>
+        </w:rPr>
+        <w:t xml:space="preserve">e par {% if etude.docEtude.signer2.gender%}sa{%else%}son{%endif%} {{ etude.docEtude.signer2.position }} {% if etude.docEtude.signer2.gender%}Mme{%else%}M. {%endif%} {{ etude.docEtude.signer2.firstname }} {{ etude.docEtude.signer2.lastname }}</w:t>
       </w:r>
     </w:p>
     <w:p>
@@ -511,7 +535,18 @@
           <w:szCs w:val="20"/>
           <w:rtl w:val="0"/>
         </w:rPr>
-        <w:t xml:space="preserve">D'autre part,</w:t>
+        <w:t xml:space="preserve">D'autre part</w:t>
+      </w:r>
+      <w:r>
+        <w:rPr>
+          <w:rtl w:val="0"/>
+        </w:rPr>
+        <w:t xml:space="preserve">.</w:t>
+      </w:r>
+      <w:r>
+        <w:rPr>
+          <w:rtl w:val="0"/>
+        </w:rPr>
       </w:r>
     </w:p>
     <w:p>
@@ -624,10 +659,10 @@
       <w:bookmarkEnd w:id="2"/>
       <w:sdt>
         <w:sdtPr>
-          <w:tag w:val="goog_rdk_0"/>
+          <w:tag w:val="goog_rdk_1"/>
         </w:sdtPr>
         <w:sdtContent>
-          <w:commentRangeStart w:id="0"/>
+          <w:commentRangeStart w:id="1"/>
         </w:sdtContent>
       </w:sdt>
       <w:r>
@@ -637,9 +672,9 @@
         </w:rPr>
         <w:t xml:space="preserve">Cahier des charges</w:t>
       </w:r>
-      <w:commentRangeEnd w:id="0"/>
-      <w:r>
-        <w:commentReference w:id="0"/>
+      <w:commentRangeEnd w:id="1"/>
+      <w:r>
+        <w:commentReference w:id="1"/>
       </w:r>
       <w:r>
         <w:rPr>
@@ -747,90 +782,6 @@
       <w:bookmarkEnd w:id="4"/>
       <w:sdt>
         <w:sdtPr>
-          <w:tag w:val="goog_rdk_1"/>
-        </w:sdtPr>
-        <w:sdtContent>
-          <w:commentRangeStart w:id="1"/>
-        </w:sdtContent>
-      </w:sdt>
-      <w:r>
-        <w:rPr>
-          <w:vertAlign w:val="baseline"/>
-          <w:rtl w:val="0"/>
-        </w:rPr>
-        <w:t xml:space="preserve">Ordonnancement et durée des phases</w:t>
-      </w:r>
-      <w:commentRangeEnd w:id="1"/>
-      <w:r>
-        <w:commentReference w:id="1"/>
-      </w:r>
-      <w:r>
-        <w:rPr>
-          <w:rtl w:val="0"/>
-        </w:rPr>
-      </w:r>
-    </w:p>
-    <w:p>
-      <w:pPr>
-        <w:pStyle w:val="Heading3"/>
-        <w:ind w:left="0" w:firstLine="0"/>
-        <w:rPr>
-          <w:b w:val="0"/>
-          <w:sz w:val="28"/>
-          <w:szCs w:val="28"/>
-        </w:rPr>
-      </w:pPr>
-      <w:bookmarkStart w:colFirst="0" w:colLast="0" w:name="_heading=h.k5zdezlkqrrr" w:id="5"/>
-      <w:bookmarkEnd w:id="5"/>
-      <w:r>
-        <w:rPr>
-          <w:b w:val="0"/>
-          <w:sz w:val="28"/>
-          <w:szCs w:val="28"/>
-          <w:rtl w:val="0"/>
-        </w:rPr>
-        <w:t xml:space="preserve">{%for groupe in etude.currentGroupes.groupe_set.iterator() | sort(attribute=’index’) %}{%for phase in groupe.phase_set.values() | sort(attribute=’index’) %}</w:t>
-      </w:r>
-    </w:p>
-    <w:p>
-      <w:pPr>
-        <w:pStyle w:val="Heading3"/>
-        <w:ind w:left="0" w:firstLine="720"/>
-        <w:rPr>
-          <w:b w:val="0"/>
-          <w:sz w:val="28"/>
-          <w:szCs w:val="28"/>
-        </w:rPr>
-      </w:pPr>
-      <w:bookmarkStart w:colFirst="0" w:colLast="0" w:name="_heading=h.css0r0xowr1l" w:id="6"/>
-      <w:bookmarkEnd w:id="6"/>
-      <w:r>
-        <w:rPr>
-          <w:sz w:val="28"/>
-          <w:szCs w:val="28"/>
-          <w:rtl w:val="0"/>
-        </w:rPr>
-        <w:t xml:space="preserve">Phase {{phase.index}}: </w:t>
-      </w:r>
-      <w:r>
-        <w:rPr>
-          <w:b w:val="0"/>
-          <w:sz w:val="28"/>
-          <w:szCs w:val="28"/>
-          <w:rtl w:val="0"/>
-        </w:rPr>
-        <w:t xml:space="preserve">{{phase.title}} </w:t>
-      </w:r>
-      <w:r>
-        <w:rPr>
-          <w:sz w:val="28"/>
-          <w:szCs w:val="28"/>
-          <w:rtl w:val="0"/>
-        </w:rPr>
-        <w:t xml:space="preserve">({{phase.nbJEH}}</w:t>
-      </w:r>
-      <w:sdt>
-        <w:sdtPr>
           <w:tag w:val="goog_rdk_2"/>
         </w:sdtPr>
         <w:sdtContent>
@@ -839,15 +790,99 @@
       </w:sdt>
       <w:r>
         <w:rPr>
+          <w:vertAlign w:val="baseline"/>
+          <w:rtl w:val="0"/>
+        </w:rPr>
+        <w:t xml:space="preserve">Ordonnancement et durée des phases</w:t>
+      </w:r>
+      <w:commentRangeEnd w:id="2"/>
+      <w:r>
+        <w:commentReference w:id="2"/>
+      </w:r>
+      <w:r>
+        <w:rPr>
+          <w:rtl w:val="0"/>
+        </w:rPr>
+      </w:r>
+    </w:p>
+    <w:p>
+      <w:pPr>
+        <w:pStyle w:val="Heading3"/>
+        <w:ind w:left="0" w:firstLine="0"/>
+        <w:rPr>
+          <w:b w:val="0"/>
           <w:sz w:val="28"/>
           <w:szCs w:val="28"/>
+        </w:rPr>
+      </w:pPr>
+      <w:bookmarkStart w:colFirst="0" w:colLast="0" w:name="_heading=h.k5zdezlkqrrr" w:id="5"/>
+      <w:bookmarkEnd w:id="5"/>
+      <w:r>
+        <w:rPr>
+          <w:b w:val="0"/>
+          <w:sz w:val="28"/>
+          <w:szCs w:val="28"/>
+          <w:rtl w:val="0"/>
+        </w:rPr>
+        <w:t xml:space="preserve">{% for phase in etude.phasesEtude.all() %}</w:t>
+      </w:r>
+    </w:p>
+    <w:p>
+      <w:pPr>
+        <w:pStyle w:val="Heading3"/>
+        <w:ind w:left="0" w:firstLine="720"/>
+        <w:rPr>
+          <w:b w:val="0"/>
+          <w:sz w:val="28"/>
+          <w:szCs w:val="28"/>
+        </w:rPr>
+      </w:pPr>
+      <w:bookmarkStart w:colFirst="0" w:colLast="0" w:name="_heading=h.css0r0xowr1l" w:id="6"/>
+      <w:bookmarkEnd w:id="6"/>
+      <w:r>
+        <w:rPr>
+          <w:sz w:val="28"/>
+          <w:szCs w:val="28"/>
+          <w:rtl w:val="0"/>
+        </w:rPr>
+        <w:t xml:space="preserve">Phase {{phase.index}}: </w:t>
+      </w:r>
+      <w:r>
+        <w:rPr>
+          <w:b w:val="0"/>
+          <w:sz w:val="28"/>
+          <w:szCs w:val="28"/>
+          <w:rtl w:val="0"/>
+        </w:rPr>
+        <w:t xml:space="preserve">{{phase.title}} </w:t>
+      </w:r>
+      <w:r>
+        <w:rPr>
+          <w:sz w:val="28"/>
+          <w:szCs w:val="28"/>
+          <w:rtl w:val="0"/>
+        </w:rPr>
+        <w:t xml:space="preserve">({{phase.nbJEH}}</w:t>
+      </w:r>
+      <w:sdt>
+        <w:sdtPr>
+          <w:tag w:val="goog_rdk_3"/>
+        </w:sdtPr>
+        <w:sdtContent>
+          <w:commentRangeStart w:id="3"/>
+        </w:sdtContent>
+      </w:sdt>
+      <w:r>
+        <w:rPr>
+          <w:sz w:val="28"/>
+          <w:szCs w:val="28"/>
           <w:rtl w:val="0"/>
         </w:rPr>
         <w:t xml:space="preserve"> </w:t>
       </w:r>
-      <w:commentRangeEnd w:id="2"/>
-      <w:r>
-        <w:commentReference w:id="2"/>
+      <w:commentRangeEnd w:id="3"/>
+      <w:r>
+        <w:commentReference w:id="3"/>
       </w:r>
       <w:r>
         <w:rPr>
@@ -1029,7 +1064,7 @@
         <w:rPr>
           <w:rtl w:val="0"/>
         </w:rPr>
-        <w:t xml:space="preserve">{%endfor%}{%endfor%}</w:t>
+        <w:t xml:space="preserve">{%endfor%}</w:t>
       </w:r>
       <w:r>
         <w:rPr>
@@ -1218,32 +1253,74 @@
     </w:p>
     <w:p>
       <w:pPr>
-        <w:keepNext w:val="0"/>
-        <w:keepLines w:val="0"/>
-        <w:pageBreakBefore w:val="0"/>
-        <w:widowControl w:val="1"/>
-        <w:pBdr>
-          <w:top w:space="0" w:sz="0" w:val="nil"/>
-          <w:left w:space="0" w:sz="0" w:val="nil"/>
-          <w:bottom w:space="0" w:sz="0" w:val="nil"/>
-          <w:right w:space="0" w:sz="0" w:val="nil"/>
-          <w:between w:space="0" w:sz="0" w:val="nil"/>
-        </w:pBdr>
-        <w:shd w:fill="auto" w:val="clear"/>
-        <w:spacing w:after="0" w:before="0" w:line="240" w:lineRule="auto"/>
-        <w:ind w:left="0" w:right="0" w:firstLine="0"/>
-        <w:jc w:val="both"/>
-        <w:rPr>
-          <w:rFonts w:ascii="Montserrat" w:cs="Montserrat" w:eastAsia="Montserrat" w:hAnsi="Montserrat"/>
-          <w:b w:val="1"/>
-          <w:sz w:val="14"/>
-          <w:szCs w:val="14"/>
-        </w:rPr>
-      </w:pPr>
-      <w:r>
-        <w:rPr>
-          <w:rtl w:val="0"/>
-        </w:rPr>
+        <w:ind w:left="720" w:firstLine="0"/>
+        <w:rPr/>
+      </w:pPr>
+      <w:r>
+        <w:rPr>
+          <w:rtl w:val="0"/>
+        </w:rPr>
+      </w:r>
+    </w:p>
+    <w:p>
+      <w:pPr>
+        <w:ind w:left="720" w:firstLine="0"/>
+        <w:rPr/>
+      </w:pPr>
+      <w:r>
+        <w:rPr>
+          <w:rtl w:val="0"/>
+        </w:rPr>
+      </w:r>
+    </w:p>
+    <w:p>
+      <w:pPr>
+        <w:ind w:left="0" w:firstLine="0"/>
+        <w:rPr/>
+      </w:pPr>
+      <w:r>
+        <w:rPr>
+          <w:rtl w:val="0"/>
+        </w:rPr>
+      </w:r>
+    </w:p>
+    <w:p>
+      <w:pPr>
+        <w:ind w:left="720" w:firstLine="0"/>
+        <w:rPr/>
+      </w:pPr>
+      <w:r>
+        <w:rPr>
+          <w:rtl w:val="0"/>
+        </w:rPr>
+      </w:r>
+    </w:p>
+    <w:p>
+      <w:pPr>
+        <w:pStyle w:val="Heading2"/>
+        <w:ind w:hanging="283.46456692913375"/>
+        <w:rPr/>
+      </w:pPr>
+      <w:bookmarkStart w:colFirst="0" w:colLast="0" w:name="_heading=h.5bhtavqg9jc1" w:id="9"/>
+      <w:bookmarkEnd w:id="9"/>
+      <w:r>
+        <w:rPr>
+          <w:rtl w:val="0"/>
+        </w:rPr>
+        <w:t xml:space="preserve">Synthèse des livrables</w:t>
+      </w:r>
+    </w:p>
+    <w:p>
+      <w:pPr>
+        <w:spacing w:after="160" w:line="259" w:lineRule="auto"/>
+        <w:ind w:firstLine="720"/>
+        <w:rPr/>
+      </w:pPr>
+      <w:r>
+        <w:rPr>
+          <w:rtl w:val="0"/>
+        </w:rPr>
+        <w:t xml:space="preserve">{{ etude.docEtude.deliverable }}</w:t>
       </w:r>
     </w:p>
     <w:p>
@@ -1261,8 +1338,8 @@
         <w:ind w:left="432" w:hanging="360"/>
         <w:rPr/>
       </w:pPr>
-      <w:bookmarkStart w:colFirst="0" w:colLast="0" w:name="_heading=h.9bji348dce6i" w:id="9"/>
-      <w:bookmarkEnd w:id="9"/>
+      <w:bookmarkStart w:colFirst="0" w:colLast="0" w:name="_heading=h.9bji348dce6i" w:id="10"/>
+      <w:bookmarkEnd w:id="10"/>
       <w:r>
         <w:rPr>
           <w:vertAlign w:val="baseline"/>
@@ -1282,8 +1359,8 @@
         <w:ind w:hanging="288"/>
         <w:rPr/>
       </w:pPr>
-      <w:bookmarkStart w:colFirst="0" w:colLast="0" w:name="_heading=h.svlhnpvqefk7" w:id="10"/>
-      <w:bookmarkEnd w:id="10"/>
+      <w:bookmarkStart w:colFirst="0" w:colLast="0" w:name="_heading=h.svlhnpvqefk7" w:id="11"/>
+      <w:bookmarkEnd w:id="11"/>
       <w:r>
         <w:rPr>
           <w:vertAlign w:val="baseline"/>
@@ -1329,8 +1406,8 @@
           <w:szCs w:val="20"/>
         </w:rPr>
       </w:pPr>
-      <w:bookmarkStart w:colFirst="0" w:colLast="0" w:name="_heading=h.c4qn79owyex7" w:id="11"/>
-      <w:bookmarkEnd w:id="11"/>
+      <w:bookmarkStart w:colFirst="0" w:colLast="0" w:name="_heading=h.c4qn79owyex7" w:id="12"/>
+      <w:bookmarkEnd w:id="12"/>
       <w:r>
         <w:rPr>
           <w:rtl w:val="0"/>
@@ -1361,64 +1438,6 @@
         </w:rPr>
         <w:t xml:space="preserve">{{semaines|int}}</w:t>
       </w:r>
-      <w:sdt>
-        <w:sdtPr>
-          <w:tag w:val="goog_rdk_3"/>
-        </w:sdtPr>
-        <w:sdtContent>
-          <w:commentRangeStart w:id="3"/>
-        </w:sdtContent>
-      </w:sdt>
-      <w:r>
-        <w:rPr>
-          <w:b w:val="1"/>
-          <w:sz w:val="24"/>
-          <w:szCs w:val="24"/>
-          <w:rtl w:val="0"/>
-        </w:rPr>
-        <w:t xml:space="preserve"> semaine</w:t>
-      </w:r>
-      <w:commentRangeEnd w:id="3"/>
-      <w:r>
-        <w:commentReference w:id="3"/>
-      </w:r>
-      <w:r>
-        <w:rPr>
-          <w:b w:val="1"/>
-          <w:sz w:val="24"/>
-          <w:szCs w:val="24"/>
-          <w:rtl w:val="0"/>
-        </w:rPr>
-        <w:t xml:space="preserve">{%if semaines&gt;1%}s{%endif%}</w:t>
-      </w:r>
-      <w:r>
-        <w:rPr>
-          <w:sz w:val="24"/>
-          <w:szCs w:val="24"/>
-          <w:rtl w:val="0"/>
-        </w:rPr>
-        <w:t xml:space="preserve"> après la signature du Bon de Commande sous réserve de la fourniture des éléments éventuellement stipulés dans le cahier des charges par le client.</w:t>
-      </w:r>
-    </w:p>
-    <w:p>
-      <w:pPr>
-        <w:rPr>
-          <w:sz w:val="24"/>
-          <w:szCs w:val="24"/>
-        </w:rPr>
-      </w:pPr>
-      <w:bookmarkStart w:colFirst="0" w:colLast="0" w:name="_heading=h.o2gn40g0acph" w:id="12"/>
-      <w:bookmarkEnd w:id="12"/>
-      <w:r>
-        <w:rPr>
-          <w:rtl w:val="0"/>
-        </w:rPr>
-      </w:r>
-    </w:p>
-    <w:p>
-      <w:pPr>
-        <w:rPr/>
-      </w:pPr>
       <w:sdt>
         <w:sdtPr>
           <w:tag w:val="goog_rdk_4"/>
@@ -1429,11 +1448,12 @@
       </w:sdt>
       <w:r>
         <w:rPr>
+          <w:b w:val="1"/>
           <w:sz w:val="24"/>
           <w:szCs w:val="24"/>
           <w:rtl w:val="0"/>
         </w:rPr>
-        <w:t xml:space="preserve">Les livra</w:t>
+        <w:t xml:space="preserve"> semaine</w:t>
       </w:r>
       <w:commentRangeEnd w:id="4"/>
       <w:r>
@@ -1441,12 +1461,80 @@
       </w:r>
       <w:r>
         <w:rPr>
+          <w:b w:val="1"/>
           <w:sz w:val="24"/>
           <w:szCs w:val="24"/>
           <w:rtl w:val="0"/>
         </w:rPr>
+        <w:t xml:space="preserve">{%if semaines&gt;1%}s{%endif%}</w:t>
+      </w:r>
+      <w:r>
+        <w:rPr>
+          <w:sz w:val="24"/>
+          <w:szCs w:val="24"/>
+          <w:rtl w:val="0"/>
+        </w:rPr>
+        <w:t xml:space="preserve"> après la signature du Bon de Commande sous réserve de la fourniture des éléments éventuellement stipulés dans le cahier des charges par le client.</w:t>
+      </w:r>
+    </w:p>
+    <w:p>
+      <w:pPr>
+        <w:rPr>
+          <w:sz w:val="24"/>
+          <w:szCs w:val="24"/>
+        </w:rPr>
+      </w:pPr>
+      <w:bookmarkStart w:colFirst="0" w:colLast="0" w:name="_heading=h.o2gn40g0acph" w:id="13"/>
+      <w:bookmarkEnd w:id="13"/>
+      <w:r>
+        <w:rPr>
+          <w:rtl w:val="0"/>
+        </w:rPr>
+      </w:r>
+    </w:p>
+    <w:p>
+      <w:pPr>
+        <w:rPr>
+          <w:sz w:val="24"/>
+          <w:szCs w:val="24"/>
+        </w:rPr>
+      </w:pPr>
+      <w:sdt>
+        <w:sdtPr>
+          <w:tag w:val="goog_rdk_5"/>
+        </w:sdtPr>
+        <w:sdtContent>
+          <w:commentRangeStart w:id="5"/>
+        </w:sdtContent>
+      </w:sdt>
+      <w:r>
+        <w:rPr>
+          <w:sz w:val="24"/>
+          <w:szCs w:val="24"/>
+          <w:rtl w:val="0"/>
+        </w:rPr>
+        <w:t xml:space="preserve">Les livra</w:t>
+      </w:r>
+      <w:commentRangeEnd w:id="5"/>
+      <w:r>
+        <w:commentReference w:id="5"/>
+      </w:r>
+      <w:r>
+        <w:rPr>
+          <w:sz w:val="24"/>
+          <w:szCs w:val="24"/>
+          <w:rtl w:val="0"/>
+        </w:rPr>
         <w:t xml:space="preserve">bles respecteront le planning prévisionnel ci-dessus sous réserve de la validation des phases préalables par le client.</w:t>
       </w:r>
+    </w:p>
+    <w:p>
+      <w:pPr>
+        <w:rPr>
+          <w:sz w:val="24"/>
+          <w:szCs w:val="24"/>
+        </w:rPr>
+      </w:pPr>
       <w:r>
         <w:rPr>
           <w:rtl w:val="0"/>
@@ -1459,8 +1547,8 @@
         <w:ind w:hanging="288"/>
         <w:rPr/>
       </w:pPr>
-      <w:bookmarkStart w:colFirst="0" w:colLast="0" w:name="_heading=h.2et92p0" w:id="13"/>
-      <w:bookmarkEnd w:id="13"/>
+      <w:bookmarkStart w:colFirst="0" w:colLast="0" w:name="_heading=h.2et92p0" w:id="14"/>
+      <w:bookmarkEnd w:id="14"/>
       <w:r>
         <w:rPr>
           <w:rtl w:val="0"/>
@@ -1477,8 +1565,8 @@
           <w:szCs w:val="22"/>
         </w:rPr>
       </w:pPr>
-      <w:bookmarkStart w:colFirst="0" w:colLast="0" w:name="_heading=h.smcti7wid0w7" w:id="14"/>
-      <w:bookmarkEnd w:id="14"/>
+      <w:bookmarkStart w:colFirst="0" w:colLast="0" w:name="_heading=h.smcti7wid0w7" w:id="15"/>
+      <w:bookmarkEnd w:id="15"/>
       <w:r>
         <w:rPr>
           <w:sz w:val="22"/>
@@ -1721,7 +1809,7 @@
                 <w:b w:val="1"/>
                 <w:rtl w:val="0"/>
               </w:rPr>
-              <w:t xml:space="preserve">{% for groupe in etude.currentGroupes.groupe_set.iterator() | sort(attribute=’index’) %}{%for phase in groupe.phase_set.iterator() | sort(attribute=’index’) %} Phase {{ loop.index }} : {{ phase.title }}</w:t>
+              <w:t xml:space="preserve">{% for phase in etude.phasesEtude.all() %}Phase {{ phase.index }} : {{ phase.title }}</w:t>
             </w:r>
           </w:p>
         </w:tc>
@@ -1872,7 +1960,7 @@
                 <w:rFonts w:ascii="Montserrat" w:cs="Montserrat" w:eastAsia="Montserrat" w:hAnsi="Montserrat"/>
                 <w:rtl w:val="0"/>
               </w:rPr>
-              <w:t xml:space="preserve">{{ phase.nbJEH*phase.priceJEH }}{%endfor%}{%endfor%}</w:t>
+              <w:t xml:space="preserve">{{ phase.nbJEH*phase.priceJEH }}{%endfor%}</w:t>
             </w:r>
           </w:p>
         </w:tc>
@@ -3130,10 +3218,10 @@
             </w:r>
             <w:sdt>
               <w:sdtPr>
-                <w:tag w:val="goog_rdk_5"/>
+                <w:tag w:val="goog_rdk_6"/>
               </w:sdtPr>
               <w:sdtContent>
-                <w:commentRangeStart w:id="5"/>
+                <w:commentRangeStart w:id="6"/>
               </w:sdtContent>
             </w:sdt>
             <w:r>
@@ -3145,9 +3233,9 @@
               </w:rPr>
               <w:t xml:space="preserve">(</w:t>
             </w:r>
-            <w:commentRangeEnd w:id="5"/>
-            <w:r>
-              <w:commentReference w:id="5"/>
+            <w:commentRangeEnd w:id="6"/>
+            <w:r>
+              <w:commentReference w:id="6"/>
             </w:r>
             <w:r>
               <w:rPr>
@@ -3263,8 +3351,8 @@
         <w:ind w:left="0" w:firstLine="0"/>
         <w:rPr/>
       </w:pPr>
-      <w:bookmarkStart w:colFirst="0" w:colLast="0" w:name="_heading=h.oi782ql8tjhi" w:id="15"/>
-      <w:bookmarkEnd w:id="15"/>
+      <w:bookmarkStart w:colFirst="0" w:colLast="0" w:name="_heading=h.oi782ql8tjhi" w:id="16"/>
+      <w:bookmarkEnd w:id="16"/>
       <w:r>
         <w:rPr>
           <w:rtl w:val="0"/>
@@ -3282,8 +3370,8 @@
           <w:szCs w:val="26"/>
         </w:rPr>
       </w:pPr>
-      <w:bookmarkStart w:colFirst="0" w:colLast="0" w:name="_heading=h.qs6cfixru1qb" w:id="16"/>
-      <w:bookmarkEnd w:id="16"/>
+      <w:bookmarkStart w:colFirst="0" w:colLast="0" w:name="_heading=h.qs6cfixru1qb" w:id="17"/>
+      <w:bookmarkEnd w:id="17"/>
       <w:r>
         <w:rPr>
           <w:rtl w:val="0"/>
@@ -4208,8 +4296,8 @@
         <w:ind w:left="0" w:firstLine="0"/>
         <w:rPr/>
       </w:pPr>
-      <w:bookmarkStart w:colFirst="0" w:colLast="0" w:name="_heading=h.v1bxlhbk4r2w" w:id="17"/>
-      <w:bookmarkEnd w:id="17"/>
+      <w:bookmarkStart w:colFirst="0" w:colLast="0" w:name="_heading=h.v1bxlhbk4r2w" w:id="18"/>
+      <w:bookmarkEnd w:id="18"/>
       <w:r>
         <w:rPr>
           <w:rtl w:val="0"/>
@@ -4480,7 +4568,7 @@
 
 <file path=word/comments.xml><?xml version="1.0" encoding="utf-8"?>
 <w:comments xmlns:mc="http://schemas.openxmlformats.org/markup-compatibility/2006" xmlns:o="urn:schemas-microsoft-com:office:office" xmlns:r="http://schemas.openxmlformats.org/officeDocument/2006/relationships" xmlns:m="http://schemas.openxmlformats.org/officeDocument/2006/math" xmlns:v="urn:schemas-microsoft-com:vml" xmlns:wp="http://schemas.openxmlformats.org/drawingml/2006/wordprocessingDrawing" xmlns:w10="urn:schemas-microsoft-com:office:word" xmlns:w="http://schemas.openxmlformats.org/wordprocessingml/2006/main" xmlns:wne="http://schemas.microsoft.com/office/word/2006/wordml" xmlns:sl="http://schemas.openxmlformats.org/schemaLibrary/2006/main" xmlns:a="http://schemas.openxmlformats.org/drawingml/2006/main" xmlns:pic="http://schemas.openxmlformats.org/drawingml/2006/picture" xmlns:c="http://schemas.openxmlformats.org/drawingml/2006/chart" xmlns:lc="http://schemas.openxmlformats.org/drawingml/2006/lockedCanvas" xmlns:dgm="http://schemas.openxmlformats.org/drawingml/2006/diagram" xmlns:wps="http://schemas.microsoft.com/office/word/2010/wordprocessingShape" xmlns:wpg="http://schemas.microsoft.com/office/word/2010/wordprocessingGroup" xmlns:w14="http://schemas.microsoft.com/office/word/2010/wordml" xmlns:w15="http://schemas.microsoft.com/office/word/2012/wordml" xmlns:w16="http://schemas.microsoft.com/office/word/2018/wordml" xmlns:w16cex="http://schemas.microsoft.com/office/word/2018/wordml/cex" xmlns:w16cid="http://schemas.microsoft.com/office/word/2016/wordml/cid" xmlns="http://schemas.microsoft.com/office/tasks/2019/documenttasks" xmlns:cr="http://schemas.microsoft.com/office/comments/2020/reactions">
-  <w:comment w:author="Maxime Even" w:id="0" w:date="2024-05-30T18:56:24Z">
+  <w:comment w:author="Maxime Even" w:id="1" w:date="2024-05-30T18:56:24Z">
     <w:p>
       <w:pPr>
         <w:keepNext w:val="0"/>
@@ -4531,7 +4619,7 @@
       </w:r>
     </w:p>
   </w:comment>
-  <w:comment w:author="Maxime Even" w:id="5" w:date="2024-05-30T19:57:33Z">
+  <w:comment w:author="Maxime Even" w:id="6" w:date="2024-05-30T19:57:33Z">
     <w:p>
       <w:pPr>
         <w:keepNext w:val="0"/>
@@ -4582,7 +4670,7 @@
       </w:r>
     </w:p>
   </w:comment>
-  <w:comment w:author="Maxime Even" w:id="3" w:date="2024-05-30T19:29:37Z">
+  <w:comment w:author="Maxime Even" w:id="4" w:date="2024-05-30T19:29:37Z">
     <w:p>
       <w:pPr>
         <w:keepNext w:val="0"/>
@@ -4633,7 +4721,7 @@
       </w:r>
     </w:p>
   </w:comment>
-  <w:comment w:author="Maxime Even" w:id="2" w:date="2024-05-31T17:03:57Z">
+  <w:comment w:author="Maxime Even" w:id="0" w:date="2025-06-13T12:53:17Z">
     <w:p>
       <w:pPr>
         <w:keepNext w:val="0"/>
@@ -4680,11 +4768,11 @@
           <w:vertAlign w:val="baseline"/>
           <w:rtl w:val="0"/>
         </w:rPr>
-        <w:t xml:space="preserve">Pour la tarification, rapprochez-vous des vieux de OuestINSA (à l'écriture de ce commentaire (31/05/2024), on sous-facture donc la tarification des anciennes études est à réajuster d'un facteur multiplicatif non-négligeable.)</w:t>
+        <w:t xml:space="preserve">rajouter le poste du signataire</w:t>
       </w:r>
     </w:p>
   </w:comment>
-  <w:comment w:author="Maxime Even" w:id="4" w:date="2024-05-30T19:32:27Z">
+  <w:comment w:author="Maxime Even" w:id="3" w:date="2024-05-31T17:03:57Z">
     <w:p>
       <w:pPr>
         <w:keepNext w:val="0"/>
@@ -4731,11 +4819,11 @@
           <w:vertAlign w:val="baseline"/>
           <w:rtl w:val="0"/>
         </w:rPr>
-        <w:t xml:space="preserve">Rappel : ne pas mettre de phase qualité, contrôle relecture, validation d’un livrable, à la finalisation de l’étude ou tout autre phase faisant référence au contrôle d’un livrable par un membre de la Junior. Pour bien différencier le statut de JE de celui d'une entreprise classique avec des salariés subordonné, nous ne pouvons pas faire cela.</w:t>
+        <w:t xml:space="preserve">Pour la tarification, rapprochez-vous des vieux de OuestINSA (à l'écriture de ce commentaire (31/05/2024), on sous-facture donc la tarification des anciennes études est à réajuster d'un facteur multiplicatif non-négligeable.)</w:t>
       </w:r>
     </w:p>
   </w:comment>
-  <w:comment w:author="Maxime Even" w:id="1" w:date="2024-05-31T17:00:31Z">
+  <w:comment w:author="Maxime Even" w:id="5" w:date="2024-05-30T19:32:27Z">
     <w:p>
       <w:pPr>
         <w:keepNext w:val="0"/>
@@ -4782,6 +4870,57 @@
           <w:vertAlign w:val="baseline"/>
           <w:rtl w:val="0"/>
         </w:rPr>
+        <w:t xml:space="preserve">Rappel : ne pas mettre de phase qualité, contrôle relecture, validation d’un livrable, à la finalisation de l’étude ou tout autre phase faisant référence au contrôle d’un livrable par un membre de la Junior. Pour bien différencier le statut de JE de celui d'une entreprise classique avec des salariés subordonné, nous ne pouvons pas faire cela.</w:t>
+      </w:r>
+    </w:p>
+  </w:comment>
+  <w:comment w:author="Maxime Even" w:id="2" w:date="2024-05-31T17:00:31Z">
+    <w:p>
+      <w:pPr>
+        <w:keepNext w:val="0"/>
+        <w:keepLines w:val="0"/>
+        <w:pageBreakBefore w:val="0"/>
+        <w:widowControl w:val="0"/>
+        <w:pBdr>
+          <w:top w:space="0" w:sz="0" w:val="nil"/>
+          <w:left w:space="0" w:sz="0" w:val="nil"/>
+          <w:bottom w:space="0" w:sz="0" w:val="nil"/>
+          <w:right w:space="0" w:sz="0" w:val="nil"/>
+          <w:between w:space="0" w:sz="0" w:val="nil"/>
+        </w:pBdr>
+        <w:shd w:fill="auto" w:val="clear"/>
+        <w:spacing w:after="0" w:before="0" w:line="240" w:lineRule="auto"/>
+        <w:ind w:left="0" w:right="0" w:firstLine="0"/>
+        <w:jc w:val="left"/>
+        <w:rPr>
+          <w:rFonts w:ascii="Arial" w:cs="Arial" w:eastAsia="Arial" w:hAnsi="Arial"/>
+          <w:b w:val="0"/>
+          <w:i w:val="0"/>
+          <w:smallCaps w:val="0"/>
+          <w:strike w:val="0"/>
+          <w:color w:val="000000"/>
+          <w:sz w:val="22"/>
+          <w:szCs w:val="22"/>
+          <w:u w:val="none"/>
+          <w:shd w:fill="auto" w:val="clear"/>
+          <w:vertAlign w:val="baseline"/>
+        </w:rPr>
+      </w:pPr>
+      <w:r>
+        <w:rPr>
+          <w:rFonts w:ascii="Arial" w:cs="Arial" w:eastAsia="Arial" w:hAnsi="Arial"/>
+          <w:b w:val="0"/>
+          <w:i w:val="0"/>
+          <w:smallCaps w:val="0"/>
+          <w:strike w:val="0"/>
+          <w:color w:val="000000"/>
+          <w:sz w:val="22"/>
+          <w:szCs w:val="22"/>
+          <w:u w:val="none"/>
+          <w:shd w:fill="auto" w:val="clear"/>
+          <w:vertAlign w:val="baseline"/>
+          <w:rtl w:val="0"/>
+        </w:rPr>
         <w:t xml:space="preserve">N'hésitez pas à échanger avec le ou les intervenants qui interviendront sur l'études pour l'écriture de l'ordonnancement et de la durée des phases</w:t>
       </w:r>
     </w:p>
@@ -4791,12 +4930,13 @@
 
 <file path=word/commentsExtended.xml><?xml version="1.0" encoding="utf-8"?>
 <w15:commentsEx xmlns:mc="http://schemas.openxmlformats.org/markup-compatibility/2006" xmlns:o="urn:schemas-microsoft-com:office:office" xmlns:r="http://schemas.openxmlformats.org/officeDocument/2006/relationships" xmlns:m="http://schemas.openxmlformats.org/officeDocument/2006/math" xmlns:v="urn:schemas-microsoft-com:vml" xmlns:wp="http://schemas.openxmlformats.org/drawingml/2006/wordprocessingDrawing" xmlns:w10="urn:schemas-microsoft-com:office:word" xmlns:w="http://schemas.openxmlformats.org/wordprocessingml/2006/main" xmlns:wne="http://schemas.microsoft.com/office/word/2006/wordml" xmlns:sl="http://schemas.openxmlformats.org/schemaLibrary/2006/main" xmlns:a="http://schemas.openxmlformats.org/drawingml/2006/main" xmlns:pic="http://schemas.openxmlformats.org/drawingml/2006/picture" xmlns:c="http://schemas.openxmlformats.org/drawingml/2006/chart" xmlns:lc="http://schemas.openxmlformats.org/drawingml/2006/lockedCanvas" xmlns:dgm="http://schemas.openxmlformats.org/drawingml/2006/diagram" xmlns:wps="http://schemas.microsoft.com/office/word/2010/wordprocessingShape" xmlns:wpg="http://schemas.microsoft.com/office/word/2010/wordprocessingGroup" xmlns:w14="http://schemas.microsoft.com/office/word/2010/wordml" xmlns:w15="http://schemas.microsoft.com/office/word/2012/wordml" xmlns:w16="http://schemas.microsoft.com/office/word/2018/wordml" xmlns:w16cex="http://schemas.microsoft.com/office/word/2018/wordml/cex" xmlns:w16cid="http://schemas.microsoft.com/office/word/2016/wordml/cid" xmlns="http://schemas.microsoft.com/office/tasks/2019/documenttasks" xmlns:cr="http://schemas.microsoft.com/office/comments/2020/reactions">
-  <w15:commentEx w15:paraId="000000AF" w15:done="0"/>
-  <w15:commentEx w15:paraId="000000B0" w15:done="0"/>
-  <w15:commentEx w15:paraId="000000B1" w15:done="0"/>
-  <w15:commentEx w15:paraId="000000B2" w15:done="0"/>
-  <w15:commentEx w15:paraId="000000B3" w15:done="0"/>
-  <w15:commentEx w15:paraId="000000B4" w15:done="0"/>
+  <w15:commentEx w15:paraId="000000B5" w15:done="0"/>
+  <w15:commentEx w15:paraId="000000B6" w15:done="0"/>
+  <w15:commentEx w15:paraId="000000B7" w15:done="0"/>
+  <w15:commentEx w15:paraId="000000B8" w15:done="0"/>
+  <w15:commentEx w15:paraId="000000B9" w15:done="0"/>
+  <w15:commentEx w15:paraId="000000BA" w15:done="0"/>
+  <w15:commentEx w15:paraId="000000BB" w15:done="0"/>
 </w15:commentsEx>
 </file>
 
@@ -4826,7 +4966,7 @@
         <w:szCs w:val="16"/>
         <w:rtl w:val="0"/>
       </w:rPr>
-      <w:t xml:space="preserve">Tous droits de reproduction réservés</w:t>
+      <w:t xml:space="preserve">Tous droits de reproduction réservés - Ouest INSA – Junior-Entreprise®</w:t>
     </w:r>
     <w:r>
       <w:rPr>
@@ -8662,7 +8802,7 @@
 
 <file path=customXML/item1.xml><?xml version="1.0" encoding="utf-8"?>
 <go:gDocsCustomXmlDataStorage xmlns:go="http://customooxmlschemas.google.com/" xmlns:r="http://schemas.openxmlformats.org/officeDocument/2006/relationships" uri="GoogleDocsCustomDataVersion2">
-  <go:docsCustomData xmlns:go="http://customooxmlschemas.google.com/" roundtripDataSignature="AMtx7mhY8V3JJfe3Tp7fHRJDXS5T241Mhw==">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</go:docsCustomData>
+  <go:docsCustomData xmlns:go="http://customooxmlschemas.google.com/" roundtripDataSignature="AMtx7mgVZ7kcHwiIJ6btuJrjScdFULpB9g==">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</go:docsCustomData>
 </go:gDocsCustomXmlDataStorage>
 </file>
 

</xml_diff>